<commit_message>
Update content and class page layout
</commit_message>
<xml_diff>
--- a/3-5北千住上級者向け特別師範教室.docx
+++ b/3-5北千住上級者向け特別師範教室.docx
@@ -168,10 +168,297 @@
     <w:p>
       <w:pPr>
         <w:rPr>
-          <w:rFonts w:eastAsia="等线" w:hint="eastAsia"/>
+          <w:rFonts w:hint="eastAsia"/>
+        </w:rPr>
+      </w:pPr>
+    </w:p>
+    <w:p>
+      <w:pPr>
+        <w:rPr>
+          <w:rFonts w:ascii="MS Mincho" w:hAnsi="MS Mincho" w:cs="MS Mincho"/>
+          <w:b/>
+          <w:bCs/>
+          <w:szCs w:val="21"/>
+        </w:rPr>
+      </w:pPr>
+      <w:r>
+        <w:t>【</w:t>
+      </w:r>
+      <w:r>
+        <w:rPr>
+          <w:rFonts w:ascii="MS Mincho" w:hAnsi="MS Mincho" w:cs="MS Mincho" w:hint="eastAsia"/>
+          <w:b/>
+          <w:bCs/>
+          <w:szCs w:val="21"/>
+        </w:rPr>
+        <w:t>師範コースの参加資格</w:t>
+      </w:r>
+      <w:r>
+        <w:t>】</w:t>
+      </w:r>
+    </w:p>
+    <w:p>
+      <w:pPr>
+        <w:rPr>
+          <w:rFonts w:eastAsia="等线"/>
+          <w:b/>
+          <w:bCs/>
+          <w:szCs w:val="21"/>
           <w:lang w:eastAsia="zh-CN"/>
         </w:rPr>
       </w:pPr>
+      <w:r>
+        <w:rPr>
+          <w:rFonts w:ascii="MS Mincho" w:eastAsia="MS Mincho" w:hAnsi="MS Mincho" w:cs="MS Mincho" w:hint="eastAsia"/>
+          <w:b/>
+          <w:bCs/>
+          <w:szCs w:val="21"/>
+        </w:rPr>
+        <w:t>・</w:t>
+      </w:r>
+      <w:r>
+        <w:rPr>
+          <w:rFonts w:ascii="等线" w:eastAsia="等线" w:hAnsi="等线" w:cs="等线" w:hint="eastAsia"/>
+          <w:b/>
+          <w:bCs/>
+          <w:szCs w:val="21"/>
+        </w:rPr>
+        <w:t>気功療術師養成講座の修了者。</w:t>
+      </w:r>
+      <w:r>
+        <w:rPr>
+          <w:rFonts w:eastAsia="等线"/>
+          <w:b/>
+          <w:bCs/>
+          <w:szCs w:val="21"/>
+        </w:rPr>
+        <w:br/>
+      </w:r>
+      <w:r>
+        <w:rPr>
+          <w:rFonts w:ascii="MS Mincho" w:eastAsia="MS Mincho" w:hAnsi="MS Mincho" w:cs="MS Mincho" w:hint="eastAsia"/>
+          <w:b/>
+          <w:bCs/>
+          <w:szCs w:val="21"/>
+        </w:rPr>
+        <w:t>・</w:t>
+      </w:r>
+      <w:r>
+        <w:rPr>
+          <w:rFonts w:ascii="等线" w:eastAsia="等线" w:hAnsi="等线" w:cs="等线" w:hint="eastAsia"/>
+          <w:b/>
+          <w:bCs/>
+          <w:szCs w:val="21"/>
+        </w:rPr>
+        <w:t>気功、太極拳、その他武術を</w:t>
+      </w:r>
+      <w:r>
+        <w:rPr>
+          <w:rFonts w:eastAsia="等线"/>
+          <w:b/>
+          <w:bCs/>
+          <w:szCs w:val="21"/>
+        </w:rPr>
+        <w:t>3</w:t>
+      </w:r>
+      <w:r>
+        <w:rPr>
+          <w:rFonts w:eastAsia="等线"/>
+          <w:b/>
+          <w:bCs/>
+          <w:szCs w:val="21"/>
+        </w:rPr>
+        <w:t>年以上修練している。</w:t>
+      </w:r>
+      <w:r>
+        <w:rPr>
+          <w:rFonts w:eastAsia="等线"/>
+          <w:b/>
+          <w:bCs/>
+          <w:szCs w:val="21"/>
+        </w:rPr>
+        <w:br/>
+      </w:r>
+      <w:r>
+        <w:rPr>
+          <w:rFonts w:ascii="MS Mincho" w:eastAsia="MS Mincho" w:hAnsi="MS Mincho" w:cs="MS Mincho" w:hint="eastAsia"/>
+          <w:b/>
+          <w:bCs/>
+          <w:szCs w:val="21"/>
+        </w:rPr>
+        <w:t>・</w:t>
+      </w:r>
+      <w:r>
+        <w:rPr>
+          <w:rFonts w:ascii="等线" w:eastAsia="等线" w:hAnsi="等线" w:cs="等线" w:hint="eastAsia"/>
+          <w:b/>
+          <w:bCs/>
+          <w:szCs w:val="21"/>
+        </w:rPr>
+        <w:t>師範もしくは会社の代表</w:t>
+      </w:r>
+      <w:r>
+        <w:rPr>
+          <w:rFonts w:ascii="MS Mincho" w:eastAsia="MS Mincho" w:hAnsi="MS Mincho" w:cs="MS Mincho" w:hint="eastAsia"/>
+          <w:b/>
+          <w:bCs/>
+          <w:szCs w:val="21"/>
+        </w:rPr>
+        <w:t>・</w:t>
+      </w:r>
+      <w:r>
+        <w:rPr>
+          <w:rFonts w:ascii="等线" w:eastAsia="等线" w:hAnsi="等线" w:cs="等线" w:hint="eastAsia"/>
+          <w:b/>
+          <w:bCs/>
+          <w:szCs w:val="21"/>
+        </w:rPr>
+        <w:t>会長である。</w:t>
+      </w:r>
+      <w:r>
+        <w:rPr>
+          <w:rFonts w:eastAsia="等线"/>
+          <w:b/>
+          <w:bCs/>
+          <w:szCs w:val="21"/>
+        </w:rPr>
+        <w:br/>
+      </w:r>
+      <w:r>
+        <w:rPr>
+          <w:rFonts w:ascii="MS Mincho" w:eastAsia="MS Mincho" w:hAnsi="MS Mincho" w:cs="MS Mincho" w:hint="eastAsia"/>
+          <w:b/>
+          <w:bCs/>
+          <w:szCs w:val="21"/>
+        </w:rPr>
+        <w:t>・</w:t>
+      </w:r>
+      <w:r>
+        <w:rPr>
+          <w:rFonts w:ascii="等线" w:eastAsia="等线" w:hAnsi="等线" w:cs="等线" w:hint="eastAsia"/>
+          <w:b/>
+          <w:bCs/>
+          <w:szCs w:val="21"/>
+        </w:rPr>
+        <w:t>医師、薬剤師、漢方医の免許をお持ちの方。</w:t>
+      </w:r>
+      <w:r>
+        <w:rPr>
+          <w:rFonts w:eastAsia="等线"/>
+          <w:b/>
+          <w:bCs/>
+          <w:szCs w:val="21"/>
+        </w:rPr>
+        <w:br/>
+      </w:r>
+      <w:r>
+        <w:rPr>
+          <w:rFonts w:ascii="MS Mincho" w:eastAsia="MS Mincho" w:hAnsi="MS Mincho" w:cs="MS Mincho" w:hint="eastAsia"/>
+          <w:b/>
+          <w:bCs/>
+          <w:szCs w:val="21"/>
+        </w:rPr>
+        <w:t>・</w:t>
+      </w:r>
+      <w:r>
+        <w:rPr>
+          <w:rFonts w:ascii="等线" w:eastAsia="等线" w:hAnsi="等线" w:cs="等线" w:hint="eastAsia"/>
+          <w:b/>
+          <w:bCs/>
+          <w:szCs w:val="21"/>
+        </w:rPr>
+        <w:t>大学の教授もしくは講師。</w:t>
+      </w:r>
+      <w:r>
+        <w:rPr>
+          <w:rFonts w:eastAsia="等线"/>
+          <w:b/>
+          <w:bCs/>
+          <w:szCs w:val="21"/>
+        </w:rPr>
+        <w:br/>
+      </w:r>
+      <w:r>
+        <w:rPr>
+          <w:rFonts w:ascii="MS Mincho" w:eastAsia="MS Mincho" w:hAnsi="MS Mincho" w:cs="MS Mincho" w:hint="eastAsia"/>
+          <w:b/>
+          <w:bCs/>
+          <w:szCs w:val="21"/>
+        </w:rPr>
+        <w:t>・</w:t>
+      </w:r>
+      <w:r>
+        <w:rPr>
+          <w:rFonts w:ascii="等线" w:eastAsia="等线" w:hAnsi="等线" w:cs="等线" w:hint="eastAsia"/>
+          <w:b/>
+          <w:bCs/>
+          <w:szCs w:val="21"/>
+        </w:rPr>
+        <w:t>専門分野での実績がある（大会での受賞など）。</w:t>
+      </w:r>
+      <w:r>
+        <w:rPr>
+          <w:rFonts w:eastAsia="等线"/>
+          <w:b/>
+          <w:bCs/>
+          <w:szCs w:val="21"/>
+        </w:rPr>
+        <w:br/>
+      </w:r>
+      <w:r>
+        <w:rPr>
+          <w:rFonts w:ascii="MS Mincho" w:eastAsia="MS Mincho" w:hAnsi="MS Mincho" w:cs="MS Mincho" w:hint="eastAsia"/>
+          <w:b/>
+          <w:bCs/>
+          <w:szCs w:val="21"/>
+        </w:rPr>
+        <w:t>・</w:t>
+      </w:r>
+      <w:r>
+        <w:rPr>
+          <w:rFonts w:ascii="等线" w:eastAsia="等线" w:hAnsi="等线" w:cs="等线" w:hint="eastAsia"/>
+          <w:b/>
+          <w:bCs/>
+          <w:szCs w:val="21"/>
+        </w:rPr>
+        <w:t>上記に当てはまらない場合は面接にて審査させて頂きます。</w:t>
+      </w:r>
+      <w:r>
+        <w:rPr>
+          <w:rFonts w:eastAsia="等线"/>
+          <w:b/>
+          <w:bCs/>
+          <w:szCs w:val="21"/>
+        </w:rPr>
+        <w:br/>
+      </w:r>
+      <w:r>
+        <w:rPr>
+          <w:rFonts w:eastAsia="等线"/>
+          <w:b/>
+          <w:bCs/>
+          <w:szCs w:val="21"/>
+          <w:lang w:eastAsia="zh-CN"/>
+        </w:rPr>
+        <w:t>※</w:t>
+      </w:r>
+      <w:r>
+        <w:rPr>
+          <w:rFonts w:eastAsia="等线"/>
+          <w:b/>
+          <w:bCs/>
+          <w:szCs w:val="21"/>
+          <w:lang w:eastAsia="zh-CN"/>
+        </w:rPr>
+        <w:t>いづれかに当てはまれば良い。</w:t>
+      </w:r>
+    </w:p>
+    <w:p>
+      <w:pPr>
+        <w:rPr>
+          <w:rFonts w:eastAsia="等线"/>
+        </w:rPr>
+      </w:pPr>
     </w:p>
     <w:p>
       <w:r>
@@ -202,6 +489,7 @@
         <w:rPr>
           <w:noProof/>
         </w:rPr>
+        <w:lastRenderedPageBreak/>
         <w:drawing>
           <wp:inline distT="0" distB="0" distL="0" distR="0" wp14:anchorId="22937991" wp14:editId="0952B399">
             <wp:extent cx="5400040" cy="1509395"/>
@@ -533,11 +821,6 @@
       </w:r>
     </w:p>
     <w:p>
-      <w:pPr>
-        <w:rPr>
-          <w:rFonts w:hint="eastAsia"/>
-        </w:rPr>
-      </w:pPr>
       <w:r>
         <w:rPr>
           <w:noProof/>
@@ -596,6 +879,13 @@
     <w:p>
       <w:pPr>
         <w:rPr>
+          <w:rFonts w:hint="eastAsia"/>
+        </w:rPr>
+      </w:pPr>
+    </w:p>
+    <w:p>
+      <w:pPr>
+        <w:rPr>
           <w:b/>
           <w:bCs/>
         </w:rPr>
@@ -612,17 +902,14 @@
       <w:pPr>
         <w:rPr>
           <w:rFonts w:eastAsia="等线"/>
-          <w:lang w:eastAsia="zh-CN"/>
-        </w:rPr>
-      </w:pPr>
-      <w:r>
+        </w:rPr>
+      </w:pPr>
+      <w:r>
+        <w:lastRenderedPageBreak/>
         <w:t>① 人間のDNAを120歳まで重大な病気をせずに元気に過ごせるように研究します。</w:t>
       </w:r>
       <w:r>
         <w:br/>
-      </w:r>
-      <w:r>
-        <w:lastRenderedPageBreak/>
         <w:t>② 体力・脳力・運気の向上についての研究。</w:t>
       </w:r>
       <w:r>
@@ -634,13 +921,7 @@
         <w:t>（胎光：先天の生命力、爽霊：霊感・直観・第六感、幽精：後天の元気）</w:t>
       </w:r>
     </w:p>
-    <w:p>
-      <w:pPr>
-        <w:rPr>
-          <w:rFonts w:hint="eastAsia"/>
-        </w:rPr>
-      </w:pPr>
-    </w:p>
+    <w:p/>
     <w:p>
       <w:pPr>
         <w:rPr>
@@ -670,281 +951,6 @@
       </w:r>
     </w:p>
     <w:p/>
-    <w:p>
-      <w:pPr>
-        <w:rPr>
-          <w:rFonts w:ascii="MS Mincho" w:hAnsi="MS Mincho" w:cs="MS Mincho" w:hint="eastAsia"/>
-          <w:b/>
-          <w:bCs/>
-          <w:szCs w:val="21"/>
-        </w:rPr>
-      </w:pPr>
-      <w:r>
-        <w:rPr>
-          <w:rFonts w:ascii="MS Mincho" w:hAnsi="MS Mincho" w:cs="MS Mincho" w:hint="eastAsia"/>
-          <w:b/>
-          <w:bCs/>
-          <w:szCs w:val="21"/>
-        </w:rPr>
-        <w:t>師範コースの参加資格</w:t>
-      </w:r>
-    </w:p>
-    <w:p>
-      <w:pPr>
-        <w:rPr>
-          <w:rFonts w:eastAsia="等线"/>
-          <w:b/>
-          <w:bCs/>
-          <w:szCs w:val="21"/>
-          <w:lang w:eastAsia="zh-CN"/>
-        </w:rPr>
-      </w:pPr>
-      <w:r>
-        <w:rPr>
-          <w:rFonts w:ascii="MS Mincho" w:eastAsia="MS Mincho" w:hAnsi="MS Mincho" w:cs="MS Mincho" w:hint="eastAsia"/>
-          <w:b/>
-          <w:bCs/>
-          <w:szCs w:val="21"/>
-        </w:rPr>
-        <w:t>・</w:t>
-      </w:r>
-      <w:r>
-        <w:rPr>
-          <w:rFonts w:ascii="等线" w:eastAsia="等线" w:hAnsi="等线" w:cs="等线" w:hint="eastAsia"/>
-          <w:b/>
-          <w:bCs/>
-          <w:szCs w:val="21"/>
-        </w:rPr>
-        <w:t>気功療術師養成講座の修了者。</w:t>
-      </w:r>
-      <w:r>
-        <w:rPr>
-          <w:rFonts w:eastAsia="等线"/>
-          <w:b/>
-          <w:bCs/>
-          <w:szCs w:val="21"/>
-        </w:rPr>
-        <w:br/>
-      </w:r>
-      <w:r>
-        <w:rPr>
-          <w:rFonts w:ascii="MS Mincho" w:eastAsia="MS Mincho" w:hAnsi="MS Mincho" w:cs="MS Mincho" w:hint="eastAsia"/>
-          <w:b/>
-          <w:bCs/>
-          <w:szCs w:val="21"/>
-        </w:rPr>
-        <w:t>・</w:t>
-      </w:r>
-      <w:r>
-        <w:rPr>
-          <w:rFonts w:ascii="等线" w:eastAsia="等线" w:hAnsi="等线" w:cs="等线" w:hint="eastAsia"/>
-          <w:b/>
-          <w:bCs/>
-          <w:szCs w:val="21"/>
-        </w:rPr>
-        <w:t>気功、太極拳、その他武術を</w:t>
-      </w:r>
-      <w:r>
-        <w:rPr>
-          <w:rFonts w:eastAsia="等线"/>
-          <w:b/>
-          <w:bCs/>
-          <w:szCs w:val="21"/>
-        </w:rPr>
-        <w:t>3</w:t>
-      </w:r>
-      <w:r>
-        <w:rPr>
-          <w:rFonts w:eastAsia="等线"/>
-          <w:b/>
-          <w:bCs/>
-          <w:szCs w:val="21"/>
-        </w:rPr>
-        <w:t>年以上修練している。</w:t>
-      </w:r>
-      <w:r>
-        <w:rPr>
-          <w:rFonts w:eastAsia="等线"/>
-          <w:b/>
-          <w:bCs/>
-          <w:szCs w:val="21"/>
-        </w:rPr>
-        <w:br/>
-      </w:r>
-      <w:r>
-        <w:rPr>
-          <w:rFonts w:ascii="MS Mincho" w:eastAsia="MS Mincho" w:hAnsi="MS Mincho" w:cs="MS Mincho" w:hint="eastAsia"/>
-          <w:b/>
-          <w:bCs/>
-          <w:szCs w:val="21"/>
-        </w:rPr>
-        <w:t>・</w:t>
-      </w:r>
-      <w:r>
-        <w:rPr>
-          <w:rFonts w:ascii="等线" w:eastAsia="等线" w:hAnsi="等线" w:cs="等线" w:hint="eastAsia"/>
-          <w:b/>
-          <w:bCs/>
-          <w:szCs w:val="21"/>
-        </w:rPr>
-        <w:t>師範もしくは会社の代表</w:t>
-      </w:r>
-      <w:r>
-        <w:rPr>
-          <w:rFonts w:ascii="MS Mincho" w:eastAsia="MS Mincho" w:hAnsi="MS Mincho" w:cs="MS Mincho" w:hint="eastAsia"/>
-          <w:b/>
-          <w:bCs/>
-          <w:szCs w:val="21"/>
-        </w:rPr>
-        <w:t>・</w:t>
-      </w:r>
-      <w:r>
-        <w:rPr>
-          <w:rFonts w:ascii="等线" w:eastAsia="等线" w:hAnsi="等线" w:cs="等线" w:hint="eastAsia"/>
-          <w:b/>
-          <w:bCs/>
-          <w:szCs w:val="21"/>
-        </w:rPr>
-        <w:t>会長である。</w:t>
-      </w:r>
-      <w:r>
-        <w:rPr>
-          <w:rFonts w:eastAsia="等线"/>
-          <w:b/>
-          <w:bCs/>
-          <w:szCs w:val="21"/>
-        </w:rPr>
-        <w:br/>
-      </w:r>
-      <w:r>
-        <w:rPr>
-          <w:rFonts w:ascii="MS Mincho" w:eastAsia="MS Mincho" w:hAnsi="MS Mincho" w:cs="MS Mincho" w:hint="eastAsia"/>
-          <w:b/>
-          <w:bCs/>
-          <w:szCs w:val="21"/>
-        </w:rPr>
-        <w:t>・</w:t>
-      </w:r>
-      <w:r>
-        <w:rPr>
-          <w:rFonts w:ascii="等线" w:eastAsia="等线" w:hAnsi="等线" w:cs="等线" w:hint="eastAsia"/>
-          <w:b/>
-          <w:bCs/>
-          <w:szCs w:val="21"/>
-        </w:rPr>
-        <w:t>医師、薬剤師、漢方医の免許をお持ちの方。</w:t>
-      </w:r>
-      <w:r>
-        <w:rPr>
-          <w:rFonts w:eastAsia="等线"/>
-          <w:b/>
-          <w:bCs/>
-          <w:szCs w:val="21"/>
-        </w:rPr>
-        <w:br/>
-      </w:r>
-      <w:r>
-        <w:rPr>
-          <w:rFonts w:ascii="MS Mincho" w:eastAsia="MS Mincho" w:hAnsi="MS Mincho" w:cs="MS Mincho" w:hint="eastAsia"/>
-          <w:b/>
-          <w:bCs/>
-          <w:szCs w:val="21"/>
-        </w:rPr>
-        <w:t>・</w:t>
-      </w:r>
-      <w:r>
-        <w:rPr>
-          <w:rFonts w:ascii="等线" w:eastAsia="等线" w:hAnsi="等线" w:cs="等线" w:hint="eastAsia"/>
-          <w:b/>
-          <w:bCs/>
-          <w:szCs w:val="21"/>
-        </w:rPr>
-        <w:t>大学の教授もしくは講師。</w:t>
-      </w:r>
-      <w:r>
-        <w:rPr>
-          <w:rFonts w:eastAsia="等线"/>
-          <w:b/>
-          <w:bCs/>
-          <w:szCs w:val="21"/>
-        </w:rPr>
-        <w:br/>
-      </w:r>
-      <w:r>
-        <w:rPr>
-          <w:rFonts w:ascii="MS Mincho" w:eastAsia="MS Mincho" w:hAnsi="MS Mincho" w:cs="MS Mincho" w:hint="eastAsia"/>
-          <w:b/>
-          <w:bCs/>
-          <w:szCs w:val="21"/>
-        </w:rPr>
-        <w:t>・</w:t>
-      </w:r>
-      <w:r>
-        <w:rPr>
-          <w:rFonts w:ascii="等线" w:eastAsia="等线" w:hAnsi="等线" w:cs="等线" w:hint="eastAsia"/>
-          <w:b/>
-          <w:bCs/>
-          <w:szCs w:val="21"/>
-        </w:rPr>
-        <w:t>専門分野での実績がある（大会での受賞など）。</w:t>
-      </w:r>
-      <w:r>
-        <w:rPr>
-          <w:rFonts w:eastAsia="等线"/>
-          <w:b/>
-          <w:bCs/>
-          <w:szCs w:val="21"/>
-        </w:rPr>
-        <w:br/>
-      </w:r>
-      <w:r>
-        <w:rPr>
-          <w:rFonts w:ascii="MS Mincho" w:eastAsia="MS Mincho" w:hAnsi="MS Mincho" w:cs="MS Mincho" w:hint="eastAsia"/>
-          <w:b/>
-          <w:bCs/>
-          <w:szCs w:val="21"/>
-        </w:rPr>
-        <w:t>・</w:t>
-      </w:r>
-      <w:r>
-        <w:rPr>
-          <w:rFonts w:ascii="等线" w:eastAsia="等线" w:hAnsi="等线" w:cs="等线" w:hint="eastAsia"/>
-          <w:b/>
-          <w:bCs/>
-          <w:szCs w:val="21"/>
-        </w:rPr>
-        <w:t>上記に当てはまらない場合は面接にて審査させて頂きます。</w:t>
-      </w:r>
-      <w:r>
-        <w:rPr>
-          <w:rFonts w:eastAsia="等线"/>
-          <w:b/>
-          <w:bCs/>
-          <w:szCs w:val="21"/>
-        </w:rPr>
-        <w:br/>
-      </w:r>
-      <w:r>
-        <w:rPr>
-          <w:rFonts w:eastAsia="等线"/>
-          <w:b/>
-          <w:bCs/>
-          <w:szCs w:val="21"/>
-          <w:lang w:eastAsia="zh-CN"/>
-        </w:rPr>
-        <w:t>※</w:t>
-      </w:r>
-      <w:r>
-        <w:rPr>
-          <w:rFonts w:eastAsia="等线"/>
-          <w:b/>
-          <w:bCs/>
-          <w:szCs w:val="21"/>
-          <w:lang w:eastAsia="zh-CN"/>
-        </w:rPr>
-        <w:t>いづれかに当てはまれば良い。</w:t>
-      </w:r>
-    </w:p>
     <w:p/>
     <w:sectPr>
       <w:pgSz w:w="11906" w:h="16838"/>
@@ -2063,6 +2069,7 @@
   <w:style w:type="character" w:default="1" w:styleId="a0">
     <w:name w:val="Default Paragraph Font"/>
     <w:uiPriority w:val="1"/>
+    <w:semiHidden/>
     <w:unhideWhenUsed/>
   </w:style>
   <w:style w:type="table" w:default="1" w:styleId="a1">

</xml_diff>